<commit_message>
sua cau tra loi cho file cau1nhanguyen.docx
</commit_message>
<xml_diff>
--- a/cau1nhanguyen.docx
+++ b/cau1nhanguyen.docx
@@ -305,12 +305,7 @@
     </w:p>
     <w:p>
       <w:r>
-        <w:t>Cấp quyền thực thi cho file filenhanguyen.sh và filenhanguyen.cpp: chmod u=rwx filenhanguyen.sh</w:t>
-      </w:r>
-    </w:p>
-    <w:p>
-      <w:r>
-        <w:t>Kiểm tra quyền (có thể không thực hiện): ls -l filenhanguyen.sh</w:t>
+        <w:t>Thực thi file filenhanguyen.sh: filenhanguyen.sh</w:t>
       </w:r>
     </w:p>
     <w:p>
@@ -325,30 +320,7 @@
       </w:r>
       <w:r>
         <w:tab/>
-      </w:r>
-      <w:r>
-        <w:tab/>
-        <w:t>ls -l filenhanguyen.cpp</w:t>
-      </w:r>
-    </w:p>
-    <w:p>
-      <w:r>
-        <w:t>Thực thi file filenhanguyen.sh: ./filenhanguyen.sh</w:t>
-      </w:r>
-    </w:p>
-    <w:p>
-      <w:r>
-        <w:tab/>
-      </w:r>
-      <w:r>
-        <w:tab/>
-      </w:r>
-      <w:r>
-        <w:tab/>
-      </w:r>
-      <w:r>
-        <w:tab/>
-        <w:t>./filenhanguyen.cpp</w:t>
+        <w:t>filenhanguyen.cpp</w:t>
       </w:r>
     </w:p>
     <w:p/>

</xml_diff>